<commit_message>
Restructure topics per HCM feedback
- 00: I-9 and background check rules by worker type, employee vs.
  contractor, data integrity
- 01 becomes Positions, Recruitment & Hiring: position management moved
  in; background checks, rehire eligibility; regional and out-of-state
  placeholder; student and faculty scenarios moved to 06
- 03 becomes Assignments: Change/Add Assignment, Change Working Hours,
  Direct Reports, Promote; transfers and promotions by workflow
- 06: Students, Faculty, and Changes subsections, plus Work Relationship
  vs. Assignment guidance
- Payroll: rename to Process grossed-up additional compensation; broaden
  the bonus course to any one-time payment
- Costing: costing follows a BU transfer and must be reviewed

Co-Authored-By: Claude Opus 5.5 <noreply@anthropic.com>
Claude-Session: https://claude.ai/code/session_01WqfFtE1Qb9uN7QDcn19AvE
</commit_message>
<xml_diff>
--- a/docs/HCM_Academy_Assessments_Draft.docx
+++ b/docs/HCM_Academy_Assessments_Draft.docx
@@ -740,7 +740,7 @@
         <w:pStyle w:val="Heading2"/>
       </w:pPr>
       <w:r>
-        <w:t xml:space="preserve">01 Recruitment &amp; Hiring</w:t>
+        <w:t xml:space="preserve">01 Positions, Recruitment &amp; Hiring</w:t>
       </w:r>
     </w:p>
     <w:p>
@@ -1864,7 +1864,7 @@
         <w:pStyle w:val="Heading2"/>
       </w:pPr>
       <w:r>
-        <w:t xml:space="preserve">03 Onboarding, Offboarding, Transfers &amp; Positions</w:t>
+        <w:t xml:space="preserve">03 Assignments</w:t>
       </w:r>
     </w:p>
     <w:p>
@@ -5360,7 +5360,7 @@
         <w:pStyle w:val="Heading2"/>
       </w:pPr>
       <w:r>
-        <w:t xml:space="preserve">01 Recruitment &amp; Hiring</w:t>
+        <w:t xml:space="preserve">01 Positions, Recruitment &amp; Hiring</w:t>
       </w:r>
     </w:p>
     <w:p>
@@ -7101,7 +7101,7 @@
         <w:pStyle w:val="Heading2"/>
       </w:pPr>
       <w:r>
-        <w:t xml:space="preserve">03 Onboarding, Offboarding, Transfers &amp; Positions</w:t>
+        <w:t xml:space="preserve">03 Assignments</w:t>
       </w:r>
     </w:p>
     <w:p>

</xml_diff>